<commit_message>
Update report figures and layout
</commit_message>
<xml_diff>
--- a/reports/Formative2_HMM_Report.docx
+++ b/reports/Formative2_HMM_Report.docx
@@ -90,7 +90,7 @@
           <w:i w:val="0"/>
           <w:sz w:val="20"/>
         </w:rPr>
-        <w:t>This project works towards a waist-worn phone that tells a carer what someone living alone is doing through the day: walking, standing, moving vigorously, or not wearing the device at all. The last case is the costly one to get wrong: a phone left on a table must never be reported as a person lying motionless, which would raise a false alarm and hide that the monitor has gone blind. The activity is never observed directly. The device reports only accelerometer, gyroscope and gravity, and a person standing quietly and a phone resting on a surface both produce an almost flat trace. A hidden Markov model matches this structure: the activity is a discrete state persisting from second to second, the features are noisy emissions of it, and the transition matrix encodes what a body can plausibly do next. The same pipeline transfers to gait monitoring, rehabilitation adherence and smart-home occupancy sensing.</w:t>
+        <w:t>This project works towards a waist-worn phone that tells a carer what someone living alone is doing: walking, standing, moving vigorously, or not wearing the device at all. The last case is the costly one: a phone left on a table must never be reported as a person lying motionless, which would raise a false alarm and hide that the monitor has gone blind. The device reports only accelerometer, gyroscope and gravity, and a person standing quietly and a phone resting on a surface both produce an almost flat trace, so the activity is hidden behind noisy measurements. A hidden Markov model matches this structure: the activity is a discrete state persisting from second to second, the features are noisy emissions of it, and the transition matrix encodes what a body can plausibly do next.</w:t>
       </w:r>
     </w:p>
     <w:p>
@@ -131,7 +131,7 @@
           <w:i w:val="0"/>
           <w:sz w:val="20"/>
         </w:rPr>
-        <w:t>Sixty-five clips were recorded with Sensor Logger 1.68 on one TECNO BG6 handset, exporting accelerometer, gyroscope and gravity as timestamped CSV. The phone was held at the waist for standing, walking and jumping, laid on a surface for still, and every clip is 8–10 s after cleaning. Table 1 summarises the result: 614.3 s in total, each activity above the 1 min 30 s minimum, 526 windows once windowed.</w:t>
+        <w:t>Sixty-five clips were recorded with Sensor Logger 1.68 on one TECNO BG6, exporting timestamped accelerometer, gyroscope and gravity CSVs: the phone held at the waist for standing, walking and jumping, laid on a surface for still, each clip 8–10 s after cleaning. Table 1 gives 614.3 s in total, every activity above the 1 min 30 s minimum.</w:t>
       </w:r>
     </w:p>
     <w:tbl>
@@ -166,6 +166,7 @@
           </w:tcPr>
           <w:p>
             <w:pPr>
+              <w:keepNext/>
               <w:spacing w:after="0"/>
               <w:jc w:val="center"/>
             </w:pPr>
@@ -187,6 +188,7 @@
           </w:tcPr>
           <w:p>
             <w:pPr>
+              <w:keepNext/>
               <w:spacing w:after="0"/>
               <w:jc w:val="center"/>
             </w:pPr>
@@ -208,6 +210,7 @@
           </w:tcPr>
           <w:p>
             <w:pPr>
+              <w:keepNext/>
               <w:spacing w:after="0"/>
               <w:jc w:val="center"/>
             </w:pPr>
@@ -229,6 +232,7 @@
           </w:tcPr>
           <w:p>
             <w:pPr>
+              <w:keepNext/>
               <w:spacing w:after="0"/>
               <w:jc w:val="center"/>
             </w:pPr>
@@ -254,6 +258,7 @@
           </w:tcPr>
           <w:p>
             <w:pPr>
+              <w:keepNext/>
               <w:spacing w:after="0"/>
               <w:jc w:val="left"/>
             </w:pPr>
@@ -272,6 +277,7 @@
           </w:tcPr>
           <w:p>
             <w:pPr>
+              <w:keepNext/>
               <w:spacing w:after="0"/>
               <w:jc w:val="center"/>
             </w:pPr>
@@ -290,6 +296,7 @@
           </w:tcPr>
           <w:p>
             <w:pPr>
+              <w:keepNext/>
               <w:spacing w:after="0"/>
               <w:jc w:val="center"/>
             </w:pPr>
@@ -308,6 +315,7 @@
           </w:tcPr>
           <w:p>
             <w:pPr>
+              <w:keepNext/>
               <w:spacing w:after="0"/>
               <w:jc w:val="center"/>
             </w:pPr>
@@ -331,6 +339,7 @@
           </w:tcPr>
           <w:p>
             <w:pPr>
+              <w:keepNext/>
               <w:spacing w:after="0"/>
               <w:jc w:val="left"/>
             </w:pPr>
@@ -349,6 +358,7 @@
           </w:tcPr>
           <w:p>
             <w:pPr>
+              <w:keepNext/>
               <w:spacing w:after="0"/>
               <w:jc w:val="center"/>
             </w:pPr>
@@ -367,6 +377,7 @@
           </w:tcPr>
           <w:p>
             <w:pPr>
+              <w:keepNext/>
               <w:spacing w:after="0"/>
               <w:jc w:val="center"/>
             </w:pPr>
@@ -385,6 +396,7 @@
           </w:tcPr>
           <w:p>
             <w:pPr>
+              <w:keepNext/>
               <w:spacing w:after="0"/>
               <w:jc w:val="center"/>
             </w:pPr>
@@ -408,6 +420,7 @@
           </w:tcPr>
           <w:p>
             <w:pPr>
+              <w:keepNext/>
               <w:spacing w:after="0"/>
               <w:jc w:val="left"/>
             </w:pPr>
@@ -426,6 +439,7 @@
           </w:tcPr>
           <w:p>
             <w:pPr>
+              <w:keepNext/>
               <w:spacing w:after="0"/>
               <w:jc w:val="center"/>
             </w:pPr>
@@ -444,6 +458,7 @@
           </w:tcPr>
           <w:p>
             <w:pPr>
+              <w:keepNext/>
               <w:spacing w:after="0"/>
               <w:jc w:val="center"/>
             </w:pPr>
@@ -462,6 +477,7 @@
           </w:tcPr>
           <w:p>
             <w:pPr>
+              <w:keepNext/>
               <w:spacing w:after="0"/>
               <w:jc w:val="center"/>
             </w:pPr>
@@ -485,6 +501,7 @@
           </w:tcPr>
           <w:p>
             <w:pPr>
+              <w:keepNext/>
               <w:spacing w:after="0"/>
               <w:jc w:val="left"/>
             </w:pPr>
@@ -503,6 +520,7 @@
           </w:tcPr>
           <w:p>
             <w:pPr>
+              <w:keepNext/>
               <w:spacing w:after="0"/>
               <w:jc w:val="center"/>
             </w:pPr>
@@ -521,6 +539,7 @@
           </w:tcPr>
           <w:p>
             <w:pPr>
+              <w:keepNext/>
               <w:spacing w:after="0"/>
               <w:jc w:val="center"/>
             </w:pPr>
@@ -539,6 +558,7 @@
           </w:tcPr>
           <w:p>
             <w:pPr>
+              <w:keepNext/>
               <w:spacing w:after="0"/>
               <w:jc w:val="center"/>
             </w:pPr>
@@ -562,6 +582,7 @@
           </w:tcPr>
           <w:p>
             <w:pPr>
+              <w:keepNext/>
               <w:spacing w:after="0"/>
               <w:jc w:val="left"/>
             </w:pPr>
@@ -580,6 +601,7 @@
           </w:tcPr>
           <w:p>
             <w:pPr>
+              <w:keepNext/>
               <w:spacing w:after="0"/>
               <w:jc w:val="center"/>
             </w:pPr>
@@ -598,6 +620,7 @@
           </w:tcPr>
           <w:p>
             <w:pPr>
+              <w:keepNext/>
               <w:spacing w:after="0"/>
               <w:jc w:val="center"/>
             </w:pPr>
@@ -616,6 +639,7 @@
           </w:tcPr>
           <w:p>
             <w:pPr>
+              <w:keepNext/>
               <w:spacing w:after="0"/>
               <w:jc w:val="center"/>
             </w:pPr>
@@ -668,7 +692,7 @@
           <w:i w:val="0"/>
           <w:sz w:val="20"/>
         </w:rPr>
-        <w:t>The app was set to sampleRateMs = 10, a nominal 100 Hz, but the measured rate is 98.7 Hz on all 65 clips and the three sensors start together but deliver slightly different sample counts, so gyroscope and gravity are interpolated onto the accelerometer clock and every recording is resampled onto a uniform 1/50 s grid (Table 2). Fifty hertz is not arbitrary: human motion lies below 20 Hz, a 25 Hz Nyquist rate retains all of it, and a 2 s window then holds exactly 100 samples. The target rate is one parameter, so a second phone at any higher rate would be decimated onto the same grid.</w:t>
+        <w:t>The app was set to sampleRateMs = 10 (nominal 100 Hz), but every clip measures 98.7 Hz and the three sensors deliver slightly different sample counts, so gyroscope and gravity are interpolated onto the accelerometer clock and each recording is low-pass filtered and resampled onto a uniform 50 Hz grid (Table 2). Human motion lies below 20 Hz, so a 25 Hz Nyquist rate keeps all of it, and a 2 s window then holds exactly 100 samples. A second phone at any higher rate would be decimated onto the same grid.</w:t>
       </w:r>
     </w:p>
     <w:tbl>
@@ -705,6 +729,7 @@
           </w:tcPr>
           <w:p>
             <w:pPr>
+              <w:keepNext/>
               <w:spacing w:after="0"/>
               <w:jc w:val="center"/>
             </w:pPr>
@@ -726,6 +751,7 @@
           </w:tcPr>
           <w:p>
             <w:pPr>
+              <w:keepNext/>
               <w:spacing w:after="0"/>
               <w:jc w:val="center"/>
             </w:pPr>
@@ -747,6 +773,7 @@
           </w:tcPr>
           <w:p>
             <w:pPr>
+              <w:keepNext/>
               <w:spacing w:after="0"/>
               <w:jc w:val="center"/>
             </w:pPr>
@@ -768,6 +795,7 @@
           </w:tcPr>
           <w:p>
             <w:pPr>
+              <w:keepNext/>
               <w:spacing w:after="0"/>
               <w:jc w:val="center"/>
             </w:pPr>
@@ -789,6 +817,7 @@
           </w:tcPr>
           <w:p>
             <w:pPr>
+              <w:keepNext/>
               <w:spacing w:after="0"/>
               <w:jc w:val="center"/>
             </w:pPr>
@@ -810,6 +839,7 @@
           </w:tcPr>
           <w:p>
             <w:pPr>
+              <w:keepNext/>
               <w:spacing w:after="0"/>
               <w:jc w:val="center"/>
             </w:pPr>
@@ -835,6 +865,7 @@
           </w:tcPr>
           <w:p>
             <w:pPr>
+              <w:keepNext/>
               <w:spacing w:after="0"/>
               <w:jc w:val="left"/>
             </w:pPr>
@@ -853,6 +884,7 @@
           </w:tcPr>
           <w:p>
             <w:pPr>
+              <w:keepNext/>
               <w:spacing w:after="0"/>
               <w:jc w:val="left"/>
             </w:pPr>
@@ -871,6 +903,7 @@
           </w:tcPr>
           <w:p>
             <w:pPr>
+              <w:keepNext/>
               <w:spacing w:after="0"/>
               <w:jc w:val="left"/>
             </w:pPr>
@@ -889,6 +922,7 @@
           </w:tcPr>
           <w:p>
             <w:pPr>
+              <w:keepNext/>
               <w:spacing w:after="0"/>
               <w:jc w:val="center"/>
             </w:pPr>
@@ -907,6 +941,7 @@
           </w:tcPr>
           <w:p>
             <w:pPr>
+              <w:keepNext/>
               <w:spacing w:after="0"/>
               <w:jc w:val="center"/>
             </w:pPr>
@@ -925,6 +960,7 @@
           </w:tcPr>
           <w:p>
             <w:pPr>
+              <w:keepNext/>
               <w:spacing w:after="0"/>
               <w:jc w:val="center"/>
             </w:pPr>
@@ -977,7 +1013,7 @@
           <w:i w:val="0"/>
           <w:sz w:val="20"/>
         </w:rPr>
-        <w:t>Each export is joined across sensors on its timestamp and converted to seconds from the first sample, trimmed by 1 s at both ends — tapping Start and Stop is itself hand motion — and cut to its central 10 s so every training file obeys the brief. Two still clips needed a larger start trim (3 s and 2 s) because the phone was still settling. Timestamps are monotonic with no gaps beyond three sample periods, and no NaNs reach the feature matrix.</w:t>
+        <w:t>Each recording is converted to seconds from its first sample, trimmed by 1 s at both ends (tapping Start and Stop is itself hand motion; two still clips needed 2–3 s while the phone settled) and cut to its central 10 s. Timestamps are monotonic, no gap exceeds three sample periods and no NaNs remain.</w:t>
       </w:r>
     </w:p>
     <w:p>
@@ -990,7 +1026,7 @@
           <w:i w:val="0"/>
           <w:sz w:val="20"/>
         </w:rPr>
-        <w:t>Features are computed on 2.0 s windows — 100 samples at 50 Hz — advanced by 1.0 s, so the hop is exactly one HMM time step. The length is set by the resolution it buys: a 100-sample FFT resolves 0.5 Hz, and the per-window dominant frequency of |a| has a median of 1.0 Hz for walking and 4.5 Hz for jumping (a jump rate of about 2.2 Hz, with take-off and landing each giving a peak), several bins apart. A 1 s window would resolve only 1 Hz and hold barely one stride; a 3 s window would span two activities inside an 8–10 s clip. The 50 % overlap gives one decision per second — a sensible alert latency — and turns 65 short clips into 526 windows, 6–9 per clip.</w:t>
+        <w:t>Features are computed on 2.0 s windows (100 samples at 50 Hz) advanced by 1.0 s, so the hop is one HMM time step. A 100-sample FFT resolves 0.5 Hz, and the per-window dominant frequency of |a| has a median of 1.0 Hz for walking and 4.5 Hz for jumping (about 2.2 jumps per second, with take-off and landing each giving a peak), several bins apart. A 1 s window would resolve only 1 Hz and hold barely one stride; a 3 s window would often span two activities. The 50 % overlap gives one decision per second and turns 65 clips into 526 windows, 6–9 per clip.</w:t>
       </w:r>
     </w:p>
     <w:p>
@@ -1113,7 +1149,7 @@
       <w:r>
         <w:drawing>
           <wp:inline xmlns:a="http://schemas.openxmlformats.org/drawingml/2006/main" xmlns:pic="http://schemas.openxmlformats.org/drawingml/2006/picture">
-            <wp:extent cx="3311999" cy="2595696"/>
+            <wp:extent cx="6263640" cy="2464481"/>
             <wp:docPr id="1" name="Picture 1"/>
             <wp:cNvGraphicFramePr>
               <a:graphicFrameLocks noChangeAspect="1"/>
@@ -1134,7 +1170,7 @@
                   <pic:spPr>
                     <a:xfrm>
                       <a:off x="0" y="0"/>
-                      <a:ext cx="3311999" cy="2595696"/>
+                      <a:ext cx="6263640" cy="2464481"/>
                     </a:xfrm>
                     <a:prstGeom prst="rect"/>
                   </pic:spPr>
@@ -1156,7 +1192,7 @@
           <w:color w:val="404040"/>
           <w:sz w:val="16"/>
         </w:rPr>
-        <w:t>Figure 1 — One cleaned clip per activity: standing and still are flat, walking is a regular ~1.1 Hz oscillation, jumping shows impacts an order of magnitude larger (acceleration in m/s², gravity removed). Figure numbers here match the submitted notebook.</w:t>
+        <w:t>Figure 1 — One cleaned clip per activity: standing and still are flat, walking is a regular ~1.1 Hz oscillation, jumping shows impacts an order of magnitude larger (acceleration in m/s², gravity removed).</w:t>
       </w:r>
     </w:p>
     <w:p>
@@ -1203,6 +1239,7 @@
           </w:tcPr>
           <w:p>
             <w:pPr>
+              <w:keepNext/>
               <w:spacing w:after="0"/>
               <w:jc w:val="center"/>
             </w:pPr>
@@ -1224,6 +1261,7 @@
           </w:tcPr>
           <w:p>
             <w:pPr>
+              <w:keepNext/>
               <w:spacing w:after="0"/>
               <w:jc w:val="center"/>
             </w:pPr>
@@ -1249,6 +1287,7 @@
           </w:tcPr>
           <w:p>
             <w:pPr>
+              <w:keepNext/>
               <w:spacing w:after="0"/>
               <w:jc w:val="left"/>
             </w:pPr>
@@ -1267,6 +1306,7 @@
           </w:tcPr>
           <w:p>
             <w:pPr>
+              <w:keepNext/>
               <w:spacing w:after="0"/>
               <w:jc w:val="left"/>
             </w:pPr>
@@ -1290,6 +1330,7 @@
           </w:tcPr>
           <w:p>
             <w:pPr>
+              <w:keepNext/>
               <w:spacing w:after="0"/>
               <w:jc w:val="left"/>
             </w:pPr>
@@ -1308,6 +1349,7 @@
           </w:tcPr>
           <w:p>
             <w:pPr>
+              <w:keepNext/>
               <w:spacing w:after="0"/>
               <w:jc w:val="left"/>
             </w:pPr>
@@ -1331,6 +1373,7 @@
           </w:tcPr>
           <w:p>
             <w:pPr>
+              <w:keepNext/>
               <w:spacing w:after="0"/>
               <w:jc w:val="left"/>
             </w:pPr>
@@ -1349,6 +1392,7 @@
           </w:tcPr>
           <w:p>
             <w:pPr>
+              <w:keepNext/>
               <w:spacing w:after="0"/>
               <w:jc w:val="left"/>
             </w:pPr>
@@ -1372,6 +1416,7 @@
           </w:tcPr>
           <w:p>
             <w:pPr>
+              <w:keepNext/>
               <w:spacing w:after="0"/>
               <w:jc w:val="left"/>
             </w:pPr>
@@ -1390,6 +1435,7 @@
           </w:tcPr>
           <w:p>
             <w:pPr>
+              <w:keepNext/>
               <w:spacing w:after="0"/>
               <w:jc w:val="left"/>
             </w:pPr>
@@ -1413,6 +1459,7 @@
           </w:tcPr>
           <w:p>
             <w:pPr>
+              <w:keepNext/>
               <w:spacing w:after="0"/>
               <w:jc w:val="left"/>
             </w:pPr>
@@ -1431,6 +1478,7 @@
           </w:tcPr>
           <w:p>
             <w:pPr>
+              <w:keepNext/>
               <w:spacing w:after="0"/>
               <w:jc w:val="left"/>
             </w:pPr>
@@ -1501,9 +1549,9 @@
         </w:tblCellMar>
       </w:tblPr>
       <w:tblGrid>
-        <w:gridCol w:w="3326"/>
-        <w:gridCol w:w="3326"/>
-        <w:gridCol w:w="3326"/>
+        <w:gridCol w:w="2050"/>
+        <w:gridCol w:w="1080"/>
+        <w:gridCol w:w="6720"/>
       </w:tblGrid>
       <w:tr>
         <w:trPr>
@@ -1512,11 +1560,12 @@
         </w:trPr>
         <w:tc>
           <w:tcPr>
-            <w:tcW w:type="dxa" w:w="2041"/>
+            <w:tcW w:type="dxa" w:w="2050"/>
             <w:shd w:val="clear" w:fill="1F3864"/>
           </w:tcPr>
           <w:p>
             <w:pPr>
+              <w:keepNext w:val="0"/>
               <w:spacing w:after="0"/>
               <w:jc w:val="center"/>
             </w:pPr>
@@ -1533,11 +1582,12 @@
         </w:tc>
         <w:tc>
           <w:tcPr>
-            <w:tcW w:type="dxa" w:w="1077"/>
+            <w:tcW w:type="dxa" w:w="1080"/>
             <w:shd w:val="clear" w:fill="1F3864"/>
           </w:tcPr>
           <w:p>
             <w:pPr>
+              <w:keepNext w:val="0"/>
               <w:spacing w:after="0"/>
               <w:jc w:val="center"/>
             </w:pPr>
@@ -1554,11 +1604,12 @@
         </w:tc>
         <w:tc>
           <w:tcPr>
-            <w:tcW w:type="dxa" w:w="6860"/>
+            <w:tcW w:type="dxa" w:w="6720"/>
             <w:shd w:val="clear" w:fill="1F3864"/>
           </w:tcPr>
           <w:p>
             <w:pPr>
+              <w:keepNext w:val="0"/>
               <w:spacing w:after="0"/>
               <w:jc w:val="center"/>
             </w:pPr>
@@ -1580,10 +1631,11 @@
         </w:trPr>
         <w:tc>
           <w:tcPr>
-            <w:tcW w:type="dxa" w:w="2041"/>
+            <w:tcW w:type="dxa" w:w="2050"/>
           </w:tcPr>
           <w:p>
             <w:pPr>
+              <w:keepNext w:val="0"/>
               <w:spacing w:after="0"/>
               <w:jc w:val="left"/>
             </w:pPr>
@@ -1598,10 +1650,11 @@
         </w:tc>
         <w:tc>
           <w:tcPr>
-            <w:tcW w:type="dxa" w:w="1077"/>
+            <w:tcW w:type="dxa" w:w="1080"/>
           </w:tcPr>
           <w:p>
             <w:pPr>
+              <w:keepNext w:val="0"/>
               <w:spacing w:after="0"/>
               <w:jc w:val="center"/>
             </w:pPr>
@@ -1616,10 +1669,11 @@
         </w:tc>
         <w:tc>
           <w:tcPr>
-            <w:tcW w:type="dxa" w:w="6860"/>
+            <w:tcW w:type="dxa" w:w="6720"/>
           </w:tcPr>
           <w:p>
             <w:pPr>
+              <w:keepNext w:val="0"/>
               <w:spacing w:after="0"/>
               <w:jc w:val="left"/>
             </w:pPr>
@@ -1639,10 +1693,11 @@
         </w:trPr>
         <w:tc>
           <w:tcPr>
-            <w:tcW w:type="dxa" w:w="2041"/>
+            <w:tcW w:type="dxa" w:w="2050"/>
           </w:tcPr>
           <w:p>
             <w:pPr>
+              <w:keepNext w:val="0"/>
               <w:spacing w:after="0"/>
               <w:jc w:val="left"/>
             </w:pPr>
@@ -1657,10 +1712,11 @@
         </w:tc>
         <w:tc>
           <w:tcPr>
-            <w:tcW w:type="dxa" w:w="1077"/>
+            <w:tcW w:type="dxa" w:w="1080"/>
           </w:tcPr>
           <w:p>
             <w:pPr>
+              <w:keepNext w:val="0"/>
               <w:spacing w:after="0"/>
               <w:jc w:val="center"/>
             </w:pPr>
@@ -1675,10 +1731,11 @@
         </w:tc>
         <w:tc>
           <w:tcPr>
-            <w:tcW w:type="dxa" w:w="6860"/>
+            <w:tcW w:type="dxa" w:w="6720"/>
           </w:tcPr>
           <w:p>
             <w:pPr>
+              <w:keepNext w:val="0"/>
               <w:spacing w:after="0"/>
               <w:jc w:val="left"/>
             </w:pPr>
@@ -1698,10 +1755,11 @@
         </w:trPr>
         <w:tc>
           <w:tcPr>
-            <w:tcW w:type="dxa" w:w="2041"/>
+            <w:tcW w:type="dxa" w:w="2050"/>
           </w:tcPr>
           <w:p>
             <w:pPr>
+              <w:keepNext w:val="0"/>
               <w:spacing w:after="0"/>
               <w:jc w:val="left"/>
             </w:pPr>
@@ -1716,10 +1774,11 @@
         </w:tc>
         <w:tc>
           <w:tcPr>
-            <w:tcW w:type="dxa" w:w="1077"/>
+            <w:tcW w:type="dxa" w:w="1080"/>
           </w:tcPr>
           <w:p>
             <w:pPr>
+              <w:keepNext w:val="0"/>
               <w:spacing w:after="0"/>
               <w:jc w:val="center"/>
             </w:pPr>
@@ -1734,10 +1793,11 @@
         </w:tc>
         <w:tc>
           <w:tcPr>
-            <w:tcW w:type="dxa" w:w="6860"/>
+            <w:tcW w:type="dxa" w:w="6720"/>
           </w:tcPr>
           <w:p>
             <w:pPr>
+              <w:keepNext w:val="0"/>
               <w:spacing w:after="0"/>
               <w:jc w:val="left"/>
             </w:pPr>
@@ -1757,10 +1817,11 @@
         </w:trPr>
         <w:tc>
           <w:tcPr>
-            <w:tcW w:type="dxa" w:w="2041"/>
+            <w:tcW w:type="dxa" w:w="2050"/>
           </w:tcPr>
           <w:p>
             <w:pPr>
+              <w:keepNext w:val="0"/>
               <w:spacing w:after="0"/>
               <w:jc w:val="left"/>
             </w:pPr>
@@ -1775,10 +1836,11 @@
         </w:tc>
         <w:tc>
           <w:tcPr>
-            <w:tcW w:type="dxa" w:w="1077"/>
+            <w:tcW w:type="dxa" w:w="1080"/>
           </w:tcPr>
           <w:p>
             <w:pPr>
+              <w:keepNext w:val="0"/>
               <w:spacing w:after="0"/>
               <w:jc w:val="center"/>
             </w:pPr>
@@ -1793,10 +1855,11 @@
         </w:tc>
         <w:tc>
           <w:tcPr>
-            <w:tcW w:type="dxa" w:w="6860"/>
+            <w:tcW w:type="dxa" w:w="6720"/>
           </w:tcPr>
           <w:p>
             <w:pPr>
+              <w:keepNext w:val="0"/>
               <w:spacing w:after="0"/>
               <w:jc w:val="left"/>
             </w:pPr>
@@ -1816,10 +1879,11 @@
         </w:trPr>
         <w:tc>
           <w:tcPr>
-            <w:tcW w:type="dxa" w:w="2041"/>
+            <w:tcW w:type="dxa" w:w="2050"/>
           </w:tcPr>
           <w:p>
             <w:pPr>
+              <w:keepNext w:val="0"/>
               <w:spacing w:after="0"/>
               <w:jc w:val="left"/>
             </w:pPr>
@@ -1834,10 +1898,11 @@
         </w:tc>
         <w:tc>
           <w:tcPr>
-            <w:tcW w:type="dxa" w:w="1077"/>
+            <w:tcW w:type="dxa" w:w="1080"/>
           </w:tcPr>
           <w:p>
             <w:pPr>
+              <w:keepNext w:val="0"/>
               <w:spacing w:after="0"/>
               <w:jc w:val="center"/>
             </w:pPr>
@@ -1852,10 +1917,11 @@
         </w:tc>
         <w:tc>
           <w:tcPr>
-            <w:tcW w:type="dxa" w:w="6860"/>
+            <w:tcW w:type="dxa" w:w="6720"/>
           </w:tcPr>
           <w:p>
             <w:pPr>
+              <w:keepNext w:val="0"/>
               <w:spacing w:after="0"/>
               <w:jc w:val="left"/>
             </w:pPr>
@@ -1875,10 +1941,11 @@
         </w:trPr>
         <w:tc>
           <w:tcPr>
-            <w:tcW w:type="dxa" w:w="2041"/>
+            <w:tcW w:type="dxa" w:w="2050"/>
           </w:tcPr>
           <w:p>
             <w:pPr>
+              <w:keepNext w:val="0"/>
               <w:spacing w:after="0"/>
               <w:jc w:val="left"/>
             </w:pPr>
@@ -1893,10 +1960,11 @@
         </w:tc>
         <w:tc>
           <w:tcPr>
-            <w:tcW w:type="dxa" w:w="1077"/>
+            <w:tcW w:type="dxa" w:w="1080"/>
           </w:tcPr>
           <w:p>
             <w:pPr>
+              <w:keepNext w:val="0"/>
               <w:spacing w:after="0"/>
               <w:jc w:val="center"/>
             </w:pPr>
@@ -1911,10 +1979,11 @@
         </w:tc>
         <w:tc>
           <w:tcPr>
-            <w:tcW w:type="dxa" w:w="6860"/>
+            <w:tcW w:type="dxa" w:w="6720"/>
           </w:tcPr>
           <w:p>
             <w:pPr>
+              <w:keepNext w:val="0"/>
               <w:spacing w:after="0"/>
               <w:jc w:val="left"/>
             </w:pPr>
@@ -1934,10 +2003,11 @@
         </w:trPr>
         <w:tc>
           <w:tcPr>
-            <w:tcW w:type="dxa" w:w="2041"/>
+            <w:tcW w:type="dxa" w:w="2050"/>
           </w:tcPr>
           <w:p>
             <w:pPr>
+              <w:keepNext w:val="0"/>
               <w:spacing w:after="0"/>
               <w:jc w:val="left"/>
             </w:pPr>
@@ -1952,10 +2022,11 @@
         </w:tc>
         <w:tc>
           <w:tcPr>
-            <w:tcW w:type="dxa" w:w="1077"/>
+            <w:tcW w:type="dxa" w:w="1080"/>
           </w:tcPr>
           <w:p>
             <w:pPr>
+              <w:keepNext w:val="0"/>
               <w:spacing w:after="0"/>
               <w:jc w:val="center"/>
             </w:pPr>
@@ -1970,10 +2041,11 @@
         </w:tc>
         <w:tc>
           <w:tcPr>
-            <w:tcW w:type="dxa" w:w="6860"/>
+            <w:tcW w:type="dxa" w:w="6720"/>
           </w:tcPr>
           <w:p>
             <w:pPr>
+              <w:keepNext w:val="0"/>
               <w:spacing w:after="0"/>
               <w:jc w:val="left"/>
             </w:pPr>
@@ -1993,10 +2065,11 @@
         </w:trPr>
         <w:tc>
           <w:tcPr>
-            <w:tcW w:type="dxa" w:w="2041"/>
+            <w:tcW w:type="dxa" w:w="2050"/>
           </w:tcPr>
           <w:p>
             <w:pPr>
+              <w:keepNext w:val="0"/>
               <w:spacing w:after="0"/>
               <w:jc w:val="left"/>
             </w:pPr>
@@ -2011,10 +2084,11 @@
         </w:tc>
         <w:tc>
           <w:tcPr>
-            <w:tcW w:type="dxa" w:w="1077"/>
+            <w:tcW w:type="dxa" w:w="1080"/>
           </w:tcPr>
           <w:p>
             <w:pPr>
+              <w:keepNext w:val="0"/>
               <w:spacing w:after="0"/>
               <w:jc w:val="center"/>
             </w:pPr>
@@ -2029,10 +2103,11 @@
         </w:tc>
         <w:tc>
           <w:tcPr>
-            <w:tcW w:type="dxa" w:w="6860"/>
+            <w:tcW w:type="dxa" w:w="6720"/>
           </w:tcPr>
           <w:p>
             <w:pPr>
+              <w:keepNext w:val="0"/>
               <w:spacing w:after="0"/>
               <w:jc w:val="left"/>
             </w:pPr>
@@ -2052,10 +2127,11 @@
         </w:trPr>
         <w:tc>
           <w:tcPr>
-            <w:tcW w:type="dxa" w:w="2041"/>
+            <w:tcW w:type="dxa" w:w="2050"/>
           </w:tcPr>
           <w:p>
             <w:pPr>
+              <w:keepNext w:val="0"/>
               <w:spacing w:after="0"/>
               <w:jc w:val="left"/>
             </w:pPr>
@@ -2070,10 +2146,11 @@
         </w:tc>
         <w:tc>
           <w:tcPr>
-            <w:tcW w:type="dxa" w:w="1077"/>
+            <w:tcW w:type="dxa" w:w="1080"/>
           </w:tcPr>
           <w:p>
             <w:pPr>
+              <w:keepNext w:val="0"/>
               <w:spacing w:after="0"/>
               <w:jc w:val="center"/>
             </w:pPr>
@@ -2088,10 +2165,11 @@
         </w:tc>
         <w:tc>
           <w:tcPr>
-            <w:tcW w:type="dxa" w:w="6860"/>
+            <w:tcW w:type="dxa" w:w="6720"/>
           </w:tcPr>
           <w:p>
             <w:pPr>
+              <w:keepNext w:val="0"/>
               <w:spacing w:after="0"/>
               <w:jc w:val="left"/>
             </w:pPr>
@@ -2111,10 +2189,11 @@
         </w:trPr>
         <w:tc>
           <w:tcPr>
-            <w:tcW w:type="dxa" w:w="2041"/>
+            <w:tcW w:type="dxa" w:w="2050"/>
           </w:tcPr>
           <w:p>
             <w:pPr>
+              <w:keepNext w:val="0"/>
               <w:spacing w:after="0"/>
               <w:jc w:val="left"/>
             </w:pPr>
@@ -2129,10 +2208,11 @@
         </w:tc>
         <w:tc>
           <w:tcPr>
-            <w:tcW w:type="dxa" w:w="1077"/>
+            <w:tcW w:type="dxa" w:w="1080"/>
           </w:tcPr>
           <w:p>
             <w:pPr>
+              <w:keepNext w:val="0"/>
               <w:spacing w:after="0"/>
               <w:jc w:val="center"/>
             </w:pPr>
@@ -2147,10 +2227,11 @@
         </w:tc>
         <w:tc>
           <w:tcPr>
-            <w:tcW w:type="dxa" w:w="6860"/>
+            <w:tcW w:type="dxa" w:w="6720"/>
           </w:tcPr>
           <w:p>
             <w:pPr>
+              <w:keepNext w:val="0"/>
               <w:spacing w:after="0"/>
               <w:jc w:val="left"/>
             </w:pPr>
@@ -2170,10 +2251,11 @@
         </w:trPr>
         <w:tc>
           <w:tcPr>
-            <w:tcW w:type="dxa" w:w="2041"/>
+            <w:tcW w:type="dxa" w:w="2050"/>
           </w:tcPr>
           <w:p>
             <w:pPr>
+              <w:keepNext w:val="0"/>
               <w:spacing w:after="0"/>
               <w:jc w:val="left"/>
             </w:pPr>
@@ -2188,10 +2270,11 @@
         </w:tc>
         <w:tc>
           <w:tcPr>
-            <w:tcW w:type="dxa" w:w="1077"/>
+            <w:tcW w:type="dxa" w:w="1080"/>
           </w:tcPr>
           <w:p>
             <w:pPr>
+              <w:keepNext w:val="0"/>
               <w:spacing w:after="0"/>
               <w:jc w:val="center"/>
             </w:pPr>
@@ -2206,10 +2289,11 @@
         </w:tc>
         <w:tc>
           <w:tcPr>
-            <w:tcW w:type="dxa" w:w="6860"/>
+            <w:tcW w:type="dxa" w:w="6720"/>
           </w:tcPr>
           <w:p>
             <w:pPr>
+              <w:keepNext w:val="0"/>
               <w:spacing w:after="0"/>
               <w:jc w:val="left"/>
             </w:pPr>
@@ -2229,10 +2313,11 @@
         </w:trPr>
         <w:tc>
           <w:tcPr>
-            <w:tcW w:type="dxa" w:w="2041"/>
+            <w:tcW w:type="dxa" w:w="2050"/>
           </w:tcPr>
           <w:p>
             <w:pPr>
+              <w:keepNext w:val="0"/>
               <w:spacing w:after="0"/>
               <w:jc w:val="left"/>
             </w:pPr>
@@ -2247,10 +2332,11 @@
         </w:tc>
         <w:tc>
           <w:tcPr>
-            <w:tcW w:type="dxa" w:w="1077"/>
+            <w:tcW w:type="dxa" w:w="1080"/>
           </w:tcPr>
           <w:p>
             <w:pPr>
+              <w:keepNext w:val="0"/>
               <w:spacing w:after="0"/>
               <w:jc w:val="center"/>
             </w:pPr>
@@ -2265,10 +2351,11 @@
         </w:tc>
         <w:tc>
           <w:tcPr>
-            <w:tcW w:type="dxa" w:w="6860"/>
+            <w:tcW w:type="dxa" w:w="6720"/>
           </w:tcPr>
           <w:p>
             <w:pPr>
+              <w:keepNext w:val="0"/>
               <w:spacing w:after="0"/>
               <w:jc w:val="left"/>
             </w:pPr>
@@ -2288,10 +2375,11 @@
         </w:trPr>
         <w:tc>
           <w:tcPr>
-            <w:tcW w:type="dxa" w:w="2041"/>
+            <w:tcW w:type="dxa" w:w="2050"/>
           </w:tcPr>
           <w:p>
             <w:pPr>
+              <w:keepNext w:val="0"/>
               <w:spacing w:after="0"/>
               <w:jc w:val="left"/>
             </w:pPr>
@@ -2306,10 +2394,11 @@
         </w:tc>
         <w:tc>
           <w:tcPr>
-            <w:tcW w:type="dxa" w:w="1077"/>
+            <w:tcW w:type="dxa" w:w="1080"/>
           </w:tcPr>
           <w:p>
             <w:pPr>
+              <w:keepNext w:val="0"/>
               <w:spacing w:after="0"/>
               <w:jc w:val="center"/>
             </w:pPr>
@@ -2324,10 +2413,11 @@
         </w:tc>
         <w:tc>
           <w:tcPr>
-            <w:tcW w:type="dxa" w:w="6860"/>
+            <w:tcW w:type="dxa" w:w="6720"/>
           </w:tcPr>
           <w:p>
             <w:pPr>
+              <w:keepNext w:val="0"/>
               <w:spacing w:after="0"/>
               <w:jc w:val="left"/>
             </w:pPr>
@@ -2347,10 +2437,11 @@
         </w:trPr>
         <w:tc>
           <w:tcPr>
-            <w:tcW w:type="dxa" w:w="2041"/>
+            <w:tcW w:type="dxa" w:w="2050"/>
           </w:tcPr>
           <w:p>
             <w:pPr>
+              <w:keepNext w:val="0"/>
               <w:spacing w:after="0"/>
               <w:jc w:val="left"/>
             </w:pPr>
@@ -2365,10 +2456,11 @@
         </w:tc>
         <w:tc>
           <w:tcPr>
-            <w:tcW w:type="dxa" w:w="1077"/>
+            <w:tcW w:type="dxa" w:w="1080"/>
           </w:tcPr>
           <w:p>
             <w:pPr>
+              <w:keepNext w:val="0"/>
               <w:spacing w:after="0"/>
               <w:jc w:val="center"/>
             </w:pPr>
@@ -2383,10 +2475,11 @@
         </w:tc>
         <w:tc>
           <w:tcPr>
-            <w:tcW w:type="dxa" w:w="6860"/>
+            <w:tcW w:type="dxa" w:w="6720"/>
           </w:tcPr>
           <w:p>
             <w:pPr>
+              <w:keepNext w:val="0"/>
               <w:spacing w:after="0"/>
               <w:jc w:val="left"/>
             </w:pPr>
@@ -2406,10 +2499,11 @@
         </w:trPr>
         <w:tc>
           <w:tcPr>
-            <w:tcW w:type="dxa" w:w="2041"/>
+            <w:tcW w:type="dxa" w:w="2050"/>
           </w:tcPr>
           <w:p>
             <w:pPr>
+              <w:keepNext w:val="0"/>
               <w:spacing w:after="0"/>
               <w:jc w:val="left"/>
             </w:pPr>
@@ -2424,10 +2518,11 @@
         </w:tc>
         <w:tc>
           <w:tcPr>
-            <w:tcW w:type="dxa" w:w="1077"/>
+            <w:tcW w:type="dxa" w:w="1080"/>
           </w:tcPr>
           <w:p>
             <w:pPr>
+              <w:keepNext w:val="0"/>
               <w:spacing w:after="0"/>
               <w:jc w:val="center"/>
             </w:pPr>
@@ -2442,10 +2537,11 @@
         </w:tc>
         <w:tc>
           <w:tcPr>
-            <w:tcW w:type="dxa" w:w="6860"/>
+            <w:tcW w:type="dxa" w:w="6720"/>
           </w:tcPr>
           <w:p>
             <w:pPr>
+              <w:keepNext w:val="0"/>
               <w:spacing w:after="0"/>
               <w:jc w:val="left"/>
             </w:pPr>
@@ -2484,7 +2580,62 @@
           <w:i w:val="0"/>
           <w:sz w:val="20"/>
         </w:rPr>
-        <w:t>The two gravity features are unsigned tilt angles, arccos(|g_axis| / |g|), not raw gravity components: a phone laid on a table can be rotated arbitrarily about the vertical, so its x and y components describe which way it points rather than what the body is doing, while the angle form is invariant to that rotation and still separates the stationary pair by roughly 45°. All features are Z-scored with μ and σ fitted on the training windows only and applied unchanged to the test windows, so no test statistic reaches the model. Standardisation is required because the features carry incompatible units (m/s², rad/s, Hz, degrees, log-power, correlation) and a diagonal Gaussian is scale-sensitive; Z-scoring was preferred to min–max, which is decided by a single extreme sample such as one hard jump landing.</w:t>
+        <w:t>The two gravity features are unsigned tilt angles, arccos(|g_axis| / |g|): a phone on a table can be turned freely about the vertical, so raw x and y gravity components describe which way it points, not the activity, while the angle ignores that rotation and still separates standing from still by about 45°. All features are Z-scored with μ and σ from the training windows only, applied unchanged to the test windows. Standardisation is needed because the units differ (m/s², rad/s, Hz, degrees, log-power) and a diagonal Gaussian is scale-sensitive; min–max was rejected because one hard jump landing would set its range.</w:t>
+      </w:r>
+    </w:p>
+    <w:p>
+      <w:pPr>
+        <w:keepNext/>
+        <w:spacing w:before="40" w:after="0"/>
+        <w:jc w:val="center"/>
+      </w:pPr>
+      <w:r>
+        <w:drawing>
+          <wp:inline xmlns:a="http://schemas.openxmlformats.org/drawingml/2006/main" xmlns:pic="http://schemas.openxmlformats.org/drawingml/2006/picture">
+            <wp:extent cx="6263640" cy="2149081"/>
+            <wp:docPr id="99" name="Figure 2"/>
+            <wp:cNvGraphicFramePr>
+              <a:graphicFrameLocks noChangeAspect="1"/>
+            </wp:cNvGraphicFramePr>
+            <a:graphic>
+              <a:graphicData uri="http://schemas.openxmlformats.org/drawingml/2006/picture">
+                <pic:pic>
+                  <pic:nvPicPr>
+                    <pic:cNvPr id="0" name="raw_signals.png"/>
+                    <pic:cNvPicPr/>
+                  </pic:nvPicPr>
+                  <pic:blipFill>
+                    <a:blip r:embed="rId16"/>
+                    <a:stretch>
+                      <a:fillRect/>
+                    </a:stretch>
+                  </pic:blipFill>
+                  <pic:spPr>
+                    <a:xfrm>
+                      <a:off x="0" y="0"/>
+                      <a:ext cx="6263640" cy="2149081"/>
+                    </a:xfrm>
+                    <a:prstGeom prst="rect"/>
+                  </pic:spPr>
+                </pic:pic>
+              </a:graphicData>
+            </a:graphic>
+          </wp:inline>
+        </w:drawing>
+      </w:r>
+    </w:p>
+    <w:p>
+      <w:pPr>
+        <w:spacing w:before="20" w:after="50"/>
+        <w:jc w:val="center"/>
+      </w:pPr>
+      <w:r>
+        <w:rPr>
+          <w:i/>
+          <w:color w:val="404040"/>
+          <w:sz w:val="16"/>
+        </w:rPr>
+        <w:t>Figure 2 — Six of the fifteen features per activity (training windows, raw units): intensity separates moving from stationary, the FFT features separate walking from jumping, and tilt alone separates standing from still.</w:t>
       </w:r>
     </w:p>
     <w:p>
@@ -2511,7 +2662,7 @@
           <w:i w:val="0"/>
           <w:sz w:val="20"/>
         </w:rPr>
-        <w:t>Random initialisation of a 4-state, 15-dimensional model on 526 windows is unstable and can settle on a permuted labelling, so the model starts from the labelled windows stitched into 10 plausible routines — an activity followed only by one that can physically follow it — and is then refined by Baum–Welch on those unlabelled sequences, exposed to 29 non-self transitions; a permutation check confirms EM never swapped the states. Baum–Welch stops when the mean per-sequence log-likelihood improves by less than ε = 1e-4, which took 3 iterations: the total log-likelihood rose from 456.89 at the labelled start to 459.19 (mean 45.92 per sequence, notebook Figure 3). EM stops quickly because the labelled start is already near a likelihood maximum. The variance floor of 1e-3 is a numerical guard against a constant feature, fixed a priori and never tuned on test data. Nine unit tests cover correctness: forward and Viterbi agree with exhaustive enumeration of every state path (to 1e-8) on short sequences, Baum–Welch never decreases the likelihood, and a 5 000-window sequence decodes without underflow.</w:t>
+        <w:t>Random initialisation of a 4-state, 15-dimensional model is unstable and can permute the labels, so the model starts from the labelled windows stitched into 10 plausible routines (each activity followed only by one that can physically follow it, giving 29 non-self transitions) and is then refined by Baum–Welch on those sequences; a permutation check confirms EM never swapped the states. Baum–Welch stops when the relative log-likelihood change falls below ε = 1e-4: here after 3 iterations, rising from 456.89 at the labelled start to 459.19 (Figure 3b), quickly because that start is already near a maximum. The variance floor of 1e-3 was fixed a priori. Nine unit tests check forward and Viterbi against exhaustive enumeration of every state path (to 1e-8), that Baum–Welch never decreases the likelihood, and that a 5 000-window sequence decodes without underflow.</w:t>
       </w:r>
     </w:p>
     <w:p>
@@ -2524,7 +2675,7 @@
           <w:i w:val="0"/>
           <w:sz w:val="20"/>
         </w:rPr>
-        <w:t>The three algorithms answer three different questions. Forward–backward computes log P(X | λ) and the posteriors, and log P(X) is exactly the quantity whose relative change is the convergence test. Baum–Welch is the only step that improves the means and variances, which is what sensitivity and specificity depend on. Viterbi returns the most probable path, and A suppresses implausible single-window flips — the one capability a per-window Gaussian classifier lacks, and therefore the one that has to be shown by comparison.</w:t>
+        <w:t>Each algorithm serves a metric. Forward–backward gives log P(X | λ), whose relative change is the convergence test. Baum–Welch is the only step that improves the means and variances, on which sensitivity and specificity depend. Viterbi returns the most probable path, and A suppresses implausible single-window flips, which a per-window classifier cannot do, so its value is measured against such a baseline.</w:t>
       </w:r>
     </w:p>
     <w:p>
@@ -2543,6 +2694,19 @@
     </w:p>
     <w:p>
       <w:pPr>
+        <w:spacing w:after="50"/>
+        <w:jc w:val="left"/>
+      </w:pPr>
+      <w:r>
+        <w:rPr>
+          <w:i w:val="0"/>
+          <w:sz w:val="20"/>
+        </w:rPr>
+        <w:t>The learned A is strongly diagonal (standing 0.93, walking 0.93, jumping 0.97, still 0.95): at a 1 s step a mean self-transition of 0.944 means an activity lasts about 18 s, which is realistic. The largest off-diagonals are plausible: standing to walking and back (0.03 and 0.02) as someone starts and stops, and walking or standing → still (0.03) as the phone is put down. Still → jumping is the smallest (0.006), consistent with physics but set by the stitching prior rather than learned.</w:t>
+      </w:r>
+    </w:p>
+    <w:p>
+      <w:pPr>
         <w:keepNext/>
         <w:spacing w:before="40" w:after="0"/>
         <w:jc w:val="center"/>
@@ -2550,7 +2714,7 @@
       <w:r>
         <w:drawing>
           <wp:inline xmlns:a="http://schemas.openxmlformats.org/drawingml/2006/main" xmlns:pic="http://schemas.openxmlformats.org/drawingml/2006/picture">
-            <wp:extent cx="1944000" cy="1640250"/>
+            <wp:extent cx="5733288" cy="2036064"/>
             <wp:docPr id="2" name="Picture 2"/>
             <wp:cNvGraphicFramePr>
               <a:graphicFrameLocks noChangeAspect="1"/>
@@ -2571,7 +2735,7 @@
                   <pic:spPr>
                     <a:xfrm>
                       <a:off x="0" y="0"/>
-                      <a:ext cx="1944000" cy="1640250"/>
+                      <a:ext cx="5733288" cy="2036064"/>
                     </a:xfrm>
                     <a:prstGeom prst="rect"/>
                   </pic:spPr>
@@ -2593,7 +2757,7 @@
           <w:color w:val="404040"/>
           <w:sz w:val="16"/>
         </w:rPr>
-        <w:t>Figure 4 — Learned transition matrix A. The diagonal dominates (0.93–0.97): activities persist from second to second.</w:t>
+        <w:t>Figure 3 — (a) Learned transition matrix A: the diagonal dominates, so activities persist from second to second. (b) Baum–Welch log-likelihood on the training routines, stopped after 3 iterations by the relative-change test.</w:t>
       </w:r>
     </w:p>
     <w:p>
@@ -2606,20 +2770,7 @@
           <w:i w:val="0"/>
           <w:sz w:val="20"/>
         </w:rPr>
-        <w:t>The learned A is strongly diagonal — standing 0.93, walking 0.93, jumping 0.97, still 0.95, mean self-transition 0.944 — which is what a 1 s step should look like, since activities last for seconds and do not flicker. The largest off-diagonal masses are the plausible ones: standing → walking and walking → standing (0.03 and 0.02) as someone starts and stops, plus walking → still and standing → still (0.03 each) as they come to rest. Still → jumping is the smallest entry (0.006), consistent with the fact that a jump cannot begin with the phone lying on a surface; that value comes from the stitching prior, which almost never places those clips side by side, rather than from anything the model discovered.</w:t>
-      </w:r>
-    </w:p>
-    <w:p>
-      <w:pPr>
-        <w:spacing w:after="50"/>
-        <w:jc w:val="left"/>
-      </w:pPr>
-      <w:r>
-        <w:rPr>
-          <w:i w:val="0"/>
-          <w:sz w:val="20"/>
-        </w:rPr>
-        <w:t>The emissions (Figure 5) are correspondingly separated: jumping occupies its own region of high acceleration and low locomotion ratio, walking is defined by a dominant frequency near 1 Hz with ~89 % of its power in the 0.8–3 Hz band, and the stationary pair differs mainly along the tilt features.</w:t>
+        <w:t>The emissions (Figure 4) are correspondingly separated: jumping occupies its own region of high acceleration and low locomotion ratio, walking is defined by a dominant frequency near 1 Hz with ~89 % of its power in the 0.8–3 Hz band, and the stationary pair differs mainly along the tilt features.</w:t>
       </w:r>
     </w:p>
     <w:p>
@@ -2645,7 +2796,7 @@
       <w:r>
         <w:drawing>
           <wp:inline xmlns:a="http://schemas.openxmlformats.org/drawingml/2006/main" xmlns:pic="http://schemas.openxmlformats.org/drawingml/2006/picture">
-            <wp:extent cx="3888000" cy="1300990"/>
+            <wp:extent cx="6263640" cy="2078177"/>
             <wp:docPr id="3" name="Picture 3"/>
             <wp:cNvGraphicFramePr>
               <a:graphicFrameLocks noChangeAspect="1"/>
@@ -2666,7 +2817,7 @@
                   <pic:spPr>
                     <a:xfrm>
                       <a:off x="0" y="0"/>
-                      <a:ext cx="3888000" cy="1300990"/>
+                      <a:ext cx="6263640" cy="2078177"/>
                     </a:xfrm>
                     <a:prstGeom prst="rect"/>
                   </pic:spPr>
@@ -2688,7 +2839,7 @@
           <w:color w:val="404040"/>
           <w:sz w:val="16"/>
         </w:rPr>
-        <w:t>Figure 5 — Emission model B: per-state Gaussian means over the 15 features (z-scored). Jumping is displaced on every intensity feature.</w:t>
+        <w:t>Figure 4 — Emission model B: (a) per-state means of all 15 z-scored features; (b, c) learned Gaussians of the strongest intensity and tilt features over the training histogram.</w:t>
       </w:r>
     </w:p>
     <w:p>
@@ -2701,7 +2852,7 @@
           <w:i w:val="0"/>
           <w:sz w:val="20"/>
         </w:rPr>
-        <w:t>The model was tested on two continuous recordings, neither of which was used to fit the normalisation, π, A or B. test_01 (100 s) was recorded on 24 October as a separate session after every training clip of that evening; test_02 (101 s) was recorded three days later in a different room, with the phone put down at 21° instead of the 8° of the original still clips. Both contain all four activities, annotated by hand. test_02 is not fully blind: its first decoding failed, prompting the tilt features and five extra still clips, two near 20° (Section 5); test_01 played no part in those changes. Windows whose 2 s span crosses an activity boundary are dropped, since no single label is correct for them: 10 in test_01 and 7 in test_02, leaving 89 and 93 scored windows.</w:t>
+        <w:t>The model was tested on two continuous recordings never used to fit the normalisation, π, A or B. test_01 (100 s) was recorded on 24 October as a separate session after every training clip of that evening; test_02 (101 s) was recorded three days later in a different room, with the phone put down at 21° instead of 8°. Both contain all four activities, annotated by hand. test_02 is not fully blind: its first decoding failed, prompting the tilt features and five extra still clips, two near 20° (Section 5); test_01 played no part in those changes. Windows spanning an activity boundary are not scored (10 in test_01, 7 in test_02), leaving 89 and 93.</w:t>
       </w:r>
     </w:p>
     <w:tbl>
@@ -2737,6 +2888,7 @@
           </w:tcPr>
           <w:p>
             <w:pPr>
+              <w:keepNext/>
               <w:spacing w:after="0"/>
               <w:jc w:val="center"/>
             </w:pPr>
@@ -2758,6 +2910,7 @@
           </w:tcPr>
           <w:p>
             <w:pPr>
+              <w:keepNext/>
               <w:spacing w:after="0"/>
               <w:jc w:val="center"/>
             </w:pPr>
@@ -2779,6 +2932,7 @@
           </w:tcPr>
           <w:p>
             <w:pPr>
+              <w:keepNext/>
               <w:spacing w:after="0"/>
               <w:jc w:val="center"/>
             </w:pPr>
@@ -2800,6 +2954,7 @@
           </w:tcPr>
           <w:p>
             <w:pPr>
+              <w:keepNext/>
               <w:spacing w:after="0"/>
               <w:jc w:val="center"/>
             </w:pPr>
@@ -2821,6 +2976,7 @@
           </w:tcPr>
           <w:p>
             <w:pPr>
+              <w:keepNext/>
               <w:spacing w:after="0"/>
               <w:jc w:val="center"/>
             </w:pPr>
@@ -2846,6 +3002,7 @@
           </w:tcPr>
           <w:p>
             <w:pPr>
+              <w:keepNext/>
               <w:spacing w:after="0"/>
               <w:jc w:val="left"/>
             </w:pPr>
@@ -2864,6 +3021,7 @@
           </w:tcPr>
           <w:p>
             <w:pPr>
+              <w:keepNext/>
               <w:spacing w:after="0"/>
               <w:jc w:val="center"/>
             </w:pPr>
@@ -2882,6 +3040,7 @@
           </w:tcPr>
           <w:p>
             <w:pPr>
+              <w:keepNext/>
               <w:spacing w:after="0"/>
               <w:jc w:val="center"/>
             </w:pPr>
@@ -2900,6 +3059,7 @@
           </w:tcPr>
           <w:p>
             <w:pPr>
+              <w:keepNext/>
               <w:spacing w:after="0"/>
               <w:jc w:val="center"/>
             </w:pPr>
@@ -2918,6 +3078,7 @@
           </w:tcPr>
           <w:p>
             <w:pPr>
+              <w:keepNext/>
               <w:spacing w:after="0"/>
               <w:jc w:val="center"/>
             </w:pPr>
@@ -2941,6 +3102,7 @@
           </w:tcPr>
           <w:p>
             <w:pPr>
+              <w:keepNext/>
               <w:spacing w:after="0"/>
               <w:jc w:val="left"/>
             </w:pPr>
@@ -2959,6 +3121,7 @@
           </w:tcPr>
           <w:p>
             <w:pPr>
+              <w:keepNext/>
               <w:spacing w:after="0"/>
               <w:jc w:val="center"/>
             </w:pPr>
@@ -2977,6 +3140,7 @@
           </w:tcPr>
           <w:p>
             <w:pPr>
+              <w:keepNext/>
               <w:spacing w:after="0"/>
               <w:jc w:val="center"/>
             </w:pPr>
@@ -2995,6 +3159,7 @@
           </w:tcPr>
           <w:p>
             <w:pPr>
+              <w:keepNext/>
               <w:spacing w:after="0"/>
               <w:jc w:val="center"/>
             </w:pPr>
@@ -3013,6 +3178,7 @@
           </w:tcPr>
           <w:p>
             <w:pPr>
+              <w:keepNext/>
               <w:spacing w:after="0"/>
               <w:jc w:val="center"/>
             </w:pPr>
@@ -3036,6 +3202,7 @@
           </w:tcPr>
           <w:p>
             <w:pPr>
+              <w:keepNext/>
               <w:spacing w:after="0"/>
               <w:jc w:val="left"/>
             </w:pPr>
@@ -3054,6 +3221,7 @@
           </w:tcPr>
           <w:p>
             <w:pPr>
+              <w:keepNext/>
               <w:spacing w:after="0"/>
               <w:jc w:val="center"/>
             </w:pPr>
@@ -3072,6 +3240,7 @@
           </w:tcPr>
           <w:p>
             <w:pPr>
+              <w:keepNext/>
               <w:spacing w:after="0"/>
               <w:jc w:val="center"/>
             </w:pPr>
@@ -3090,6 +3259,7 @@
           </w:tcPr>
           <w:p>
             <w:pPr>
+              <w:keepNext/>
               <w:spacing w:after="0"/>
               <w:jc w:val="center"/>
             </w:pPr>
@@ -3108,6 +3278,7 @@
           </w:tcPr>
           <w:p>
             <w:pPr>
+              <w:keepNext/>
               <w:spacing w:after="0"/>
               <w:jc w:val="center"/>
             </w:pPr>
@@ -3131,6 +3302,7 @@
           </w:tcPr>
           <w:p>
             <w:pPr>
+              <w:keepNext/>
               <w:spacing w:after="0"/>
               <w:jc w:val="left"/>
             </w:pPr>
@@ -3149,6 +3321,7 @@
           </w:tcPr>
           <w:p>
             <w:pPr>
+              <w:keepNext/>
               <w:spacing w:after="0"/>
               <w:jc w:val="center"/>
             </w:pPr>
@@ -3167,6 +3340,7 @@
           </w:tcPr>
           <w:p>
             <w:pPr>
+              <w:keepNext/>
               <w:spacing w:after="0"/>
               <w:jc w:val="center"/>
             </w:pPr>
@@ -3185,6 +3359,7 @@
           </w:tcPr>
           <w:p>
             <w:pPr>
+              <w:keepNext/>
               <w:spacing w:after="0"/>
               <w:jc w:val="center"/>
             </w:pPr>
@@ -3203,6 +3378,7 @@
           </w:tcPr>
           <w:p>
             <w:pPr>
+              <w:keepNext/>
               <w:spacing w:after="0"/>
               <w:jc w:val="center"/>
             </w:pPr>
@@ -3241,7 +3417,7 @@
           <w:i w:val="0"/>
           <w:sz w:val="20"/>
         </w:rPr>
-        <w:t>Overall accuracy is 96.2 % against a 25 % chance level, and not uniform: 1.000 on test_01 and 0.925 on test_02, the harder session with the unusual placement. The confusion matrix (Figure 6) locates every remaining error. Standing and jumping are perfect. Still recovers 26 of 27 windows; its one miss, predicted as jumping, is the first window after the phone is put down (88 s in test_02), while it is still settling. Walking is weakest at 0.842: of 38 windows, 5 read as standing and 1 as jumping, all within one 62–69 s stretch of test_02 where the accelerometer spread falls to 0.11–0.17 m/s² against a training median of 0.31 m/s². The walk slowed to short steps there, which places it between the walking and standing distributions.</w:t>
+        <w:t>Overall accuracy is 96.2 % against a 25 % chance level: 1.000 on test_01 and 0.925 on test_02. The confusion matrix (Figure 5) locates every error. Standing and jumping are perfect. Still's one miss, read as jumping, is the first window after the phone is put down (88 s in test_02), while it settles. Walking is weakest at 0.842: 5 windows read as standing and 1 as jumping, all in one 62–69 s stretch of test_02 where the accelerometer spread falls to 0.11–0.17 m/s² against a training median of 0.31 m/s², a slowed walk between the walking and standing distributions.</w:t>
       </w:r>
     </w:p>
     <w:p>
@@ -3253,7 +3429,7 @@
       <w:r>
         <w:drawing>
           <wp:inline xmlns:a="http://schemas.openxmlformats.org/drawingml/2006/main" xmlns:pic="http://schemas.openxmlformats.org/drawingml/2006/picture">
-            <wp:extent cx="4248000" cy="1982818"/>
+            <wp:extent cx="5181600" cy="2218944"/>
             <wp:docPr id="4" name="Picture 4"/>
             <wp:cNvGraphicFramePr>
               <a:graphicFrameLocks noChangeAspect="1"/>
@@ -3274,7 +3450,7 @@
                   <pic:spPr>
                     <a:xfrm>
                       <a:off x="0" y="0"/>
-                      <a:ext cx="4248000" cy="1982818"/>
+                      <a:ext cx="5181600" cy="2218944"/>
                     </a:xfrm>
                     <a:prstGeom prst="rect"/>
                   </pic:spPr>
@@ -3296,7 +3472,7 @@
           <w:color w:val="404040"/>
           <w:sz w:val="16"/>
         </w:rPr>
-        <w:t>Figure 6 — Confusion matrices on the unseen recordings: (a) Viterbi, 96.2 %; (b) per-window Gaussian baseline, 95.6 %.</w:t>
+        <w:t>Figure 5 — Confusion matrices on the unseen recordings: (a) Viterbi, 96.2 %; (b) per-window Gaussian baseline, 95.6 %.</w:t>
       </w:r>
     </w:p>
     <w:p>
@@ -3309,7 +3485,7 @@
           <w:i w:val="0"/>
           <w:sz w:val="20"/>
         </w:rPr>
-        <w:t>A no-HMM baseline that scores each window independently gives 95.6 %, so transitions add 0.5 percentage points: of the six walking windows the baseline read as standing, A pulled one back, and it changed nothing that was already correct. The gain is small because the Gaussian separation is already strong.</w:t>
+        <w:t>A no-HMM baseline that scores each window independently gives 95.6 %: of the six walking windows it read as standing, A pulled one back and changed nothing already correct. The gain is small because the Gaussian separation is already strong.</w:t>
       </w:r>
     </w:p>
     <w:p>
@@ -3321,7 +3497,7 @@
       <w:r>
         <w:drawing>
           <wp:inline xmlns:a="http://schemas.openxmlformats.org/drawingml/2006/main" xmlns:pic="http://schemas.openxmlformats.org/drawingml/2006/picture">
-            <wp:extent cx="4248000" cy="1920431"/>
+            <wp:extent cx="6263640" cy="1918239"/>
             <wp:docPr id="5" name="Picture 5"/>
             <wp:cNvGraphicFramePr>
               <a:graphicFrameLocks noChangeAspect="1"/>
@@ -3342,7 +3518,7 @@
                   <pic:spPr>
                     <a:xfrm>
                       <a:off x="0" y="0"/>
-                      <a:ext cx="4248000" cy="1920431"/>
+                      <a:ext cx="6263640" cy="1918239"/>
                     </a:xfrm>
                     <a:prstGeom prst="rect"/>
                   </pic:spPr>
@@ -3364,7 +3540,7 @@
           <w:color w:val="404040"/>
           <w:sz w:val="16"/>
         </w:rPr>
-        <w:t>Figure 7 — Decoded sequence for test_02: the Viterbi path over the true labels.</w:t>
+        <w:t>Figure 6 — Decoded sequences for both unseen recordings: ground truth, Viterbi path and per-window baseline. Grey windows straddle a transition and are not scored.</w:t>
       </w:r>
     </w:p>
     <w:p>
@@ -3391,7 +3567,7 @@
           <w:i w:val="0"/>
           <w:sz w:val="20"/>
         </w:rPr>
-        <w:t>Jumping was trivially separable: its intensity features sit an order of magnitude above every other state. The hard pair was standing versus still, and the most instructive result. All 15 original still clips shared one placement: their z-axis tilt spread was 0.12° and the within-state spread of grav_x was 0.012 m/s², so the fitted Gaussian behaved as a delta function. When the second session set the phone down at 21° instead of 8°, that state scored a log-likelihood near −44 000 and every still window was decoded as jumping: accuracy 0.901, still sensitivity 0.556. Two changes fixed it, in order of importance — replacing raw gravity components with yaw-invariant tilt angles, and recording five more still clips at deliberately varied placements (propped on books at about 10° and 18°, a soft indoor surface, grass outdoors), which widened the state's tilt coverage from 7.9–8.3° to 7.9–20.5°. Still sensitivity rose to 0.963 and overall accuracy to 0.962 with no hyper-parameter change, and the variance-floor sweep from 1e-3 to 0.1 is flat. Because the fix was prompted by test_02, its still score is partly a re-test on a condition the training set was extended to cover; test_01, untouched by the change, scores 1.000. A class defined by how a sensor is mounted needs that mounting variation in its training set; an over-confident emission model is usually a symptom of missing coverage rather than of bad regularisation.</w:t>
+        <w:t>Jumping was trivially separable: its intensity features sit an order of magnitude above every other state. The hard pair was standing versus still, separated almost only by tilt. All 15 original still clips shared one placement (tilt spread 0.12°), so the fitted Gaussian behaved as a delta function: when test_02 set the phone down at 21° instead of 8°, every still window was decoded as jumping (accuracy 0.901, still sensitivity 0.556). Two changes fixed it: yaw-invariant tilt angles instead of raw gravity components, and five more still clips at deliberately varied placements (books at about 10° and 18°, a soft surface, grass), widening tilt coverage from 7.9–8.3° to 7.9–20.5°. Still sensitivity rose to 0.963 and accuracy to 0.962 with no hyper-parameter change, and a variance-floor sweep from 1e-3 to 0.1 is flat. Because test_02 prompted the fix, its still score is partly a re-test; test_01, untouched, scores 1.000. A class defined by how a sensor is mounted needs that variation in training: an over-confident emission model usually signals missing coverage, not poor regularisation.</w:t>
       </w:r>
     </w:p>
     <w:p>
@@ -3404,7 +3580,7 @@
           <w:i w:val="0"/>
           <w:sz w:val="20"/>
         </w:rPr>
-        <w:t>The transition probabilities reflect realistic behaviour: a self-transition near 0.94 at a 1 s step means an activity persists for about 18 s on average, and the off-diagonals favour orders a body can actually perform.</w:t>
+        <w:t>Resampling to 50 Hz after anti-alias filtering removed the 98.7 versus 100 Hz rate error and the sample-count mismatch, and 0.5 Hz resolution is well finer than the gap between the 1.0 Hz and 4.5 Hz peaks. The remaining noise is behavioural: switching seconds cannot be given one label, so they are not scored, and hand tremor through the grip is what makes standing overlap still.</w:t>
       </w:r>
     </w:p>
     <w:p>
@@ -3417,20 +3593,7 @@
           <w:i w:val="0"/>
           <w:sz w:val="20"/>
         </w:rPr>
-        <w:t>Sampling and noise shaped the result in two ways. The nominal 100 Hz rate measured 98.7 Hz and the sensors' sample counts differed slightly; resampling to 50 Hz after anti-alias filtering removes both the rate error and the timestamp jitter, and 0.5 Hz resolution is comfortably finer than the gap between the 1.0 Hz walking and 4.5 Hz jumping peaks. The remaining difficulty is behavioural, not electrical: the seconds during which a person changes activity cannot be given one label, which is why those windows are dropped, and hand tremor through the grip is what makes standing and still overlap.</w:t>
-      </w:r>
-    </w:p>
-    <w:p>
-      <w:pPr>
-        <w:spacing w:after="50"/>
-        <w:jc w:val="left"/>
-      </w:pPr>
-      <w:r>
-        <w:rPr>
-          <w:i w:val="0"/>
-          <w:sz w:val="20"/>
-        </w:rPr>
-        <w:t>A third test session recorded after all changes would make every reported number fully blind. Walking, now the weak state, needs clips at different paces and on stairs, and a pocket placement and a second handset would test whether the tilt features survive a different grip. Reprojecting acceleration into vertical, forward and lateral axes would remove the remaining dependence on how the phone is held, a Gaussian mixture per state would describe walking better than one diagonal Gaussian, and multi-minute routines would estimate A from real transition timing.</w:t>
+        <w:t>Improvements: a third test session recorded after all changes would make every number fully blind; walking at different paces and on stairs, a pocket placement and a second phone would test the weak state and the tilt features; reprojecting acceleration onto vertical, forward and lateral axes would remove the dependence on grip; and a Gaussian mixture per state with multi-minute routines would model walking and real transition timing better.</w:t>
       </w:r>
     </w:p>
     <w:p>

</xml_diff>